<commit_message>
CL3: author the full assessment instrument set (AT1/AT2/AT3) — validated 72/72
AT1 Design (ICTCLD504 el 1-2): assessor + student + Solution Design exemplar (corrected — encryption is baseline, not an improvement). AT2 Team Implementation (BSBXTW401 el 1-4): assessor + student + embedded led-meeting observation checklist; the divided CloudFormation write is the team-work vehicle (not 504-assessed). AT3 Implement (ICTCLD504 el 3-4): assessor + student; apply-as-update model, demonstrate the whole system. All Kangan Project-Assessment instruments, single-sourced (student derives from assessor). Plan updated (§6.8 AT3 lab-pack support set; §7 component breakdown + encryption/data decisions resolved). Validation: cluster coverage 72/72 PASS + AT1/AT2/AT3 bidirectional traceability PASS. Removes the superseded Team-Setup instruments (team plan moves to AT2).

Co-Authored-By: Claude Opus 4.8 <noreply@anthropic.com>
</commit_message>
<xml_diff>
--- a/S1-CL3-Cloud-Infrastructure-Improvement/assessments/AT1/AT1-exemplar-solution-design.docx
+++ b/S1-CL3-Cloud-Infrastructure-Improvement/assessments/AT1/AT1-exemplar-solution-design.docx
@@ -1252,7 +1252,7 @@
               <w:rPr>
                 <w:sz w:val="18"/>
               </w:rPr>
-              <w:t>Internal-only (VPN), security groups in place; patching/role/encryption posture not hardened</w:t>
+              <w:t>Internal-only (VPN), encrypted at rest, security groups in place; patching/role posture not hardened</w:t>
             </w:r>
           </w:p>
         </w:tc>
@@ -1271,7 +1271,7 @@
               <w:rPr>
                 <w:sz w:val="18"/>
               </w:rPr>
-              <w:t>Tighten least-privilege, encryption at rest, managed patching and secrets</w:t>
+              <w:t>Tighten least-privilege, managed patching, secrets and TLS (encryption at rest is already in the baseline)</w:t>
             </w:r>
           </w:p>
         </w:tc>
@@ -1654,7 +1654,7 @@
               <w:rPr>
                 <w:sz w:val="18"/>
               </w:rPr>
-              <w:t>Least-privilege, encrypted, managed-patch posture</w:t>
+              <w:t>Least-privilege, secrets-managed, managed-patch posture (baseline already encrypted at rest)</w:t>
             </w:r>
           </w:p>
         </w:tc>
@@ -1673,7 +1673,7 @@
               <w:rPr>
                 <w:sz w:val="18"/>
               </w:rPr>
-              <w:t>0 plaintext secrets; 100% volumes/buckets encrypted; patch compliance reported</w:t>
+              <w:t>0 plaintext secrets; managed-patch compliance reported; least-privilege roles/SGs in place</w:t>
             </w:r>
           </w:p>
         </w:tc>
@@ -2653,7 +2653,7 @@
               <w:rPr>
                 <w:sz w:val="18"/>
               </w:rPr>
-              <w:t>Encryption at rest (KMS) and in transit; credentials in Secrets Manager with rotation; security group restricting access to the app tier; not publicly accessible</w:t>
+              <w:t>Encryption in transit (TLS); credentials in Secrets Manager with rotation; security group restricting access to the app tier; not publicly accessible (encryption at rest is already enabled in the baseline)</w:t>
             </w:r>
           </w:p>
         </w:tc>
@@ -2896,7 +2896,7 @@
               <w:rPr>
                 <w:sz w:val="18"/>
               </w:rPr>
-              <w:t>SSE-KMS on all buckets and volumes; S3 Block Public Access; bucket policies; S3 access logging</w:t>
+              <w:t>S3 Block Public Access; bucket policies; S3 access logging (encryption at rest is already enabled in the baseline)</w:t>
             </w:r>
           </w:p>
         </w:tc>

</xml_diff>